<commit_message>
Programa referidos asesores: la recarga la autoriza el financiero tras revisar el cierre contable del mes
Co-Authored-By: Claude Fable 5.1 <noreply@anthropic.com>
</commit_message>
<xml_diff>
--- a/recursos/comercial/INDUCCION_COMERCIAL/contratacion comercial/PROGRAMA_REFERIDOS_ASESORES_ENTIDADES.docx
+++ b/recursos/comercial/INDUCCION_COMERCIAL/contratacion comercial/PROGRAMA_REFERIDOS_ASESORES_ENTIDADES.docx
@@ -243,7 +243,7 @@
                 <w:b w:val="0"/>
                 <w:sz w:val="16"/>
               </w:rPr>
-              <w:t>En el cierre del mes en que entra el pago. La recarga la autoriza gerencia con el visto bueno de la contadora. El gerente de alianzas no autoriza recargas: es parte interesada.</w:t>
+              <w:t>En el cierre del mes en que entra el pago. La recarga la autoriza el financiero después de revisar el cierre contable del mes. El gerente de alianzas no autoriza recargas: es parte interesada.</w:t>
             </w:r>
           </w:p>
         </w:tc>
@@ -906,7 +906,7 @@
                 <w:b w:val="0"/>
                 <w:sz w:val="16"/>
               </w:rPr>
-              <w:t>Contadora y gerencia</w:t>
+              <w:t>Financiero</w:t>
             </w:r>
           </w:p>
         </w:tc>
@@ -923,7 +923,7 @@
                 <w:b w:val="0"/>
                 <w:sz w:val="16"/>
               </w:rPr>
-              <w:t>Confirman pago recibido y retracto cumplido; gerencia autoriza la recarga en el cierre del mes.</w:t>
+              <w:t>Revisa el cierre contable del mes, confirma pago recibido y retracto cumplido, y autoriza la recarga.</w:t>
             </w:r>
           </w:p>
         </w:tc>

</xml_diff>

<commit_message>
Referidos asesores: QR por codigo de asesora reemplaza el formulario; vigencia 30 dias; base previa solo descalifica con gestion humana en los 30 dias previos; script gen_qr_asesoras
Co-Authored-By: Claude Fable 5.1 <noreply@anthropic.com>
</commit_message>
<xml_diff>
--- a/recursos/comercial/INDUCCION_COMERCIAL/contratacion comercial/PROGRAMA_REFERIDOS_ASESORES_ENTIDADES.docx
+++ b/recursos/comercial/INDUCCION_COMERCIAL/contratacion comercial/PROGRAMA_REFERIDOS_ASESORES_ENTIDADES.docx
@@ -26,7 +26,7 @@
           <w:color w:val="666666"/>
           <w:sz w:val="17"/>
         </w:rPr>
-        <w:t>Hoja interna del Gerente de Alianzas · 22/10/2026 · piloto hasta el 31 de enero de 2027 · a las asesoras les llega la pieza, no esta hoja</w:t>
+        <w:t>Hoja interna del Gerente de Alianzas · 23/10/2026 · piloto hasta el 31 de enero de 2027 · a las asesoras les llega la pieza, no esta hoja</w:t>
       </w:r>
     </w:p>
     <w:p>
@@ -38,12 +38,12 @@
           <w:b w:val="0"/>
           <w:sz w:val="18"/>
         </w:rPr>
-        <w:t>Qué es: un bono para el asesor o asesora de una entidad aliada (caja, cooperativa, fondo) por cada afiliado que registre y que se matricule en Heiiu pagando de contado. Qué no es: una comisión de venta. La asesora refiere; la cita y el cierre los hace nuestro equipo. Todo lo que se ofrece está en esta hoja; lo que no está aquí, no se ofrece.</w:t>
+        <w:t>Qué es: un bono para el asesor o asesora de una entidad aliada (caja, cooperativa, fondo) por cada afiliado que escriba a Heiiu con su código y se matricule pagando de contado. Qué no es: una comisión de venta. La asesora refiere; la cita y el cierre los hace nuestro equipo. Todo lo que se ofrece está en esta hoja; lo que no está aquí, no se ofrece.</w:t>
       </w:r>
     </w:p>
     <w:p>
       <w:pPr>
-        <w:spacing w:before="60" w:after="20"/>
+        <w:spacing w:before="40" w:after="20"/>
       </w:pPr>
       <w:r>
         <w:rPr>
@@ -279,7 +279,7 @@
                 <w:b w:val="0"/>
                 <w:sz w:val="16"/>
               </w:rPr>
-              <w:t>Matrículas financiadas por cuotas con Heiiu; afiliados que ya estaban en nuestra base antes del registro; referidos sin código; retiros dentro del retracto.</w:t>
+              <w:t>Matrículas financiadas por cuotas con Heiiu; afiliados con gestión humana de nuestro equipo en los 30 días previos a su mensaje; referidos sin código; retiros dentro del retracto.</w:t>
             </w:r>
           </w:p>
         </w:tc>
@@ -323,12 +323,18 @@
     </w:tbl>
     <w:p>
       <w:pPr>
-        <w:spacing w:after="0"/>
+        <w:spacing w:after="0" w:line="120" w:lineRule="exact"/>
       </w:pPr>
+      <w:r>
+        <w:rPr>
+          <w:sz w:val="8"/>
+        </w:rPr>
+        <w:t xml:space="preserve"> </w:t>
+      </w:r>
     </w:p>
     <w:p>
       <w:pPr>
-        <w:spacing w:before="60" w:after="20"/>
+        <w:spacing w:before="40" w:after="20"/>
       </w:pPr>
       <w:r>
         <w:rPr>
@@ -336,7 +342,7 @@
           <w:color w:val="E54C09"/>
           <w:sz w:val="21"/>
         </w:rPr>
-        <w:t>2. Registro del referido (formulario)</w:t>
+        <w:t>2. Código y QR de cada asesora (no hay formulario)</w:t>
       </w:r>
     </w:p>
     <w:p>
@@ -348,7 +354,7 @@
           <w:b w:val="0"/>
           <w:sz w:val="18"/>
         </w:rPr>
-        <w:t>Formulario creado desde la cuenta institucional, nunca desde un correo personal. Respuestas en una hoja de cálculo que ve gerencia. Campos: código de asesor · entidad y oficina · nombre del afiliado · celular del afiliado · para qué quiere el inglés (opcional) · casilla obligatoria "el afiliado sabe que lo registro y está de acuerdo en que Heiiu le escriba". Fecha y hora las pone el formulario.</w:t>
+        <w:t>Cada asesora tiene un código propio (por ejemplo C-07) y un QR con ese código, impreso y por WhatsApp. El QR abre WhatsApp en la línea de alianzas (316 768 8793) con el mensaje ya escrito: "Hola, quiero información para estudiar inglés en Heiiu. Código de asesor: C-07". El mismo enlace se reenvía por WhatsApp. La asesora no digita datos de nadie.</w:t>
       </w:r>
     </w:p>
     <w:p>
@@ -360,7 +366,7 @@
           <w:b w:val="0"/>
           <w:sz w:val="18"/>
         </w:rPr>
-        <w:t>El primer mensaje a Heiiu lo manda el afiliado, no nosotros. Al enviar el formulario, la asesora recibe un texto listo para reenviarle: "Hola, para estudiar inglés en Heiiu escribe al 316 768 8793 y da el código [código]. Te atienden en menos de un día hábil." Heiiu no llama a nadie que no haya escrito.</w:t>
+        <w:t>El primer mensaje lo manda el afiliado, no nosotros: escanea el QR o toca el enlace y pulsa enviar. Su número, el código y la hora quedan en la línea; ese es el registro. Heiiu no llama a nadie que no haya escrito. Coordinación lleva en una hoja de cálculo cada mensaje con código: fecha, código, celular, contactado, cita, matrícula pagada, bono recargado.</w:t>
       </w:r>
     </w:p>
     <w:tbl>
@@ -427,7 +433,7 @@
                 <w:b/>
                 <w:sz w:val="16"/>
               </w:rPr>
-              <w:t>Primer registro gana</w:t>
+              <w:t>Primer mensaje gana</w:t>
             </w:r>
           </w:p>
         </w:tc>
@@ -444,7 +450,7 @@
                 <w:b w:val="0"/>
                 <w:sz w:val="16"/>
               </w:rPr>
-              <w:t>Si dos asesoras registran el mismo celular, el bono es de la que registró primero. La hora del formulario decide.</w:t>
+              <w:t>Si un mismo celular llega con dos códigos, el bono es del código del primer mensaje. La hora de WhatsApp decide.</w:t>
             </w:r>
           </w:p>
         </w:tc>
@@ -463,7 +469,7 @@
                 <w:b/>
                 <w:sz w:val="16"/>
               </w:rPr>
-              <w:t>Vale 90 días</w:t>
+              <w:t>Vale 30 días</w:t>
             </w:r>
           </w:p>
         </w:tc>
@@ -480,7 +486,7 @@
                 <w:b w:val="0"/>
                 <w:sz w:val="16"/>
               </w:rPr>
-              <w:t>Si el afiliado se matricula después de tres meses del registro, no hay bono.</w:t>
+              <w:t>Si la matrícula no se paga dentro de los 30 días siguientes al primer mensaje, no hay bono: la asesora lo ayuda a matricularse rápido.</w:t>
             </w:r>
           </w:p>
         </w:tc>
@@ -516,7 +522,7 @@
                 <w:b w:val="0"/>
                 <w:sz w:val="16"/>
               </w:rPr>
-              <w:t>Si el celular ya estaba en nuestra base (pauta, plataforma, reactivaciones) antes del registro, no hay bono. Coordinación lo verifica antes de marcar la matrícula como referida.</w:t>
+              <w:t>Que el celular ya esté en nuestra base (pauta, plataforma, reactivaciones) no quita el bono. Lo quita que en los 30 días previos al mensaje alguien del equipo lo haya llamado o gestionado; los mensajes automáticos del bot no cuentan como gestión. Coordinación lo verifica antes de marcar la matrícula como referida.</w:t>
             </w:r>
           </w:p>
         </w:tc>
@@ -524,12 +530,18 @@
     </w:tbl>
     <w:p>
       <w:pPr>
-        <w:spacing w:after="0"/>
+        <w:spacing w:after="0" w:line="120" w:lineRule="exact"/>
       </w:pPr>
+      <w:r>
+        <w:rPr>
+          <w:sz w:val="8"/>
+        </w:rPr>
+        <w:t xml:space="preserve"> </w:t>
+      </w:r>
     </w:p>
     <w:p>
       <w:pPr>
-        <w:spacing w:before="60" w:after="20"/>
+        <w:spacing w:before="40" w:after="20"/>
       </w:pPr>
       <w:r>
         <w:rPr>
@@ -658,7 +670,7 @@
                 <w:b w:val="0"/>
                 <w:sz w:val="16"/>
               </w:rPr>
-              <w:t>Le cuenta al afiliado, lo registra en el formulario y le reenvía el texto con su código.</w:t>
+              <w:t>Le cuenta al afiliado y le muestra su QR o le reenvía su enlace.</w:t>
             </w:r>
           </w:p>
         </w:tc>
@@ -711,7 +723,7 @@
                 <w:b w:val="0"/>
                 <w:sz w:val="16"/>
               </w:rPr>
-              <w:t>Escribe a la línea de alianzas con el código.</w:t>
+              <w:t>Escanea el QR o toca el enlace y envía el mensaje con el código a la línea de alianzas.</w:t>
             </w:r>
           </w:p>
         </w:tc>
@@ -764,7 +776,7 @@
                 <w:b w:val="0"/>
                 <w:sz w:val="16"/>
               </w:rPr>
-              <w:t>Responde en menos de un día hábil, confirma el código contra la hoja y pasa el contacto a la asesora comercial para la cita. No vende él.</w:t>
+              <w:t>Responde en menos de un día hábil, confirma el código contra la lista de códigos y pasa el contacto a la asesora comercial para la cita. No vende él.</w:t>
             </w:r>
           </w:p>
         </w:tc>
@@ -870,7 +882,7 @@
                 <w:b w:val="0"/>
                 <w:sz w:val="16"/>
               </w:rPr>
-              <w:t>En la hoja de respuestas marca: contactado · cita · matrícula pagada · bono recargado, con fecha. Verifica base previa y los 90 días.</w:t>
+              <w:t>Anota en la hoja de cálculo cada mensaje con código y marca: contactado · cita · matrícula pagada · bono recargado, con fecha. Verifica base previa y los 30 días.</w:t>
             </w:r>
           </w:p>
         </w:tc>
@@ -984,12 +996,18 @@
     </w:tbl>
     <w:p>
       <w:pPr>
-        <w:spacing w:after="0"/>
+        <w:spacing w:after="0" w:line="120" w:lineRule="exact"/>
       </w:pPr>
+      <w:r>
+        <w:rPr>
+          <w:sz w:val="8"/>
+        </w:rPr>
+        <w:t xml:space="preserve"> </w:t>
+      </w:r>
     </w:p>
     <w:p>
       <w:pPr>
-        <w:spacing w:before="60" w:after="20"/>
+        <w:spacing w:before="40" w:after="20"/>
       </w:pPr>
       <w:r>
         <w:rPr>
@@ -1014,7 +1032,7 @@
     </w:p>
     <w:p>
       <w:pPr>
-        <w:spacing w:before="60" w:after="20"/>
+        <w:spacing w:before="40" w:after="20"/>
       </w:pPr>
       <w:r>
         <w:rPr>
@@ -1056,12 +1074,18 @@
     </w:tbl>
     <w:p>
       <w:pPr>
-        <w:spacing w:after="0"/>
+        <w:spacing w:after="0" w:line="120" w:lineRule="exact"/>
       </w:pPr>
+      <w:r>
+        <w:rPr>
+          <w:sz w:val="8"/>
+        </w:rPr>
+        <w:t xml:space="preserve"> </w:t>
+      </w:r>
     </w:p>
     <w:p>
       <w:pPr>
-        <w:spacing w:before="60" w:after="20"/>
+        <w:spacing w:before="40" w:after="20"/>
       </w:pPr>
       <w:r>
         <w:rPr>
@@ -1085,7 +1109,7 @@
       <w:tr>
         <w:tc>
           <w:tcPr>
-            <w:tcW w:type="dxa" w:w="8164"/>
+            <w:tcW w:type="dxa" w:w="7710"/>
             <w:shd w:val="clear" w:color="auto" w:fill="E54C09"/>
           </w:tcPr>
           <w:p>
@@ -1104,7 +1128,7 @@
         </w:tc>
         <w:tc>
           <w:tcPr>
-            <w:tcW w:type="dxa" w:w="2268"/>
+            <w:tcW w:type="dxa" w:w="2721"/>
             <w:shd w:val="clear" w:color="auto" w:fill="E54C09"/>
           </w:tcPr>
           <w:p>
@@ -1125,7 +1149,7 @@
       <w:tr>
         <w:tc>
           <w:tcPr>
-            <w:tcW w:type="dxa" w:w="8164"/>
+            <w:tcW w:type="dxa" w:w="7710"/>
           </w:tcPr>
           <w:p>
             <w:pPr>
@@ -1142,7 +1166,7 @@
         </w:tc>
         <w:tc>
           <w:tcPr>
-            <w:tcW w:type="dxa" w:w="2268"/>
+            <w:tcW w:type="dxa" w:w="2721"/>
           </w:tcPr>
           <w:p>
             <w:pPr>
@@ -1161,7 +1185,7 @@
       <w:tr>
         <w:tc>
           <w:tcPr>
-            <w:tcW w:type="dxa" w:w="8164"/>
+            <w:tcW w:type="dxa" w:w="7710"/>
           </w:tcPr>
           <w:p>
             <w:pPr>
@@ -1178,7 +1202,7 @@
         </w:tc>
         <w:tc>
           <w:tcPr>
-            <w:tcW w:type="dxa" w:w="2268"/>
+            <w:tcW w:type="dxa" w:w="2721"/>
           </w:tcPr>
           <w:p>
             <w:pPr>
@@ -1197,7 +1221,7 @@
       <w:tr>
         <w:tc>
           <w:tcPr>
-            <w:tcW w:type="dxa" w:w="8164"/>
+            <w:tcW w:type="dxa" w:w="7710"/>
           </w:tcPr>
           <w:p>
             <w:pPr>
@@ -1214,7 +1238,7 @@
         </w:tc>
         <w:tc>
           <w:tcPr>
-            <w:tcW w:type="dxa" w:w="2268"/>
+            <w:tcW w:type="dxa" w:w="2721"/>
           </w:tcPr>
           <w:p>
             <w:pPr>
@@ -1233,7 +1257,7 @@
       <w:tr>
         <w:tc>
           <w:tcPr>
-            <w:tcW w:type="dxa" w:w="8164"/>
+            <w:tcW w:type="dxa" w:w="7710"/>
           </w:tcPr>
           <w:p>
             <w:pPr>
@@ -1244,13 +1268,49 @@
                 <w:b/>
                 <w:sz w:val="16"/>
               </w:rPr>
-              <w:t>Formulario creado desde la cuenta institucional, link y QR en la pieza; lista de códigos por asesora.</w:t>
+              <w:t>Lista de códigos por asesora (sin nombres en la lista que circula) y un QR por código, impreso y por WhatsApp.</w:t>
             </w:r>
           </w:p>
         </w:tc>
         <w:tc>
           <w:tcPr>
-            <w:tcW w:type="dxa" w:w="2268"/>
+            <w:tcW w:type="dxa" w:w="2721"/>
+          </w:tcPr>
+          <w:p>
+            <w:pPr>
+              <w:spacing w:after="0"/>
+            </w:pPr>
+            <w:r>
+              <w:rPr>
+                <w:b w:val="0"/>
+                <w:sz w:val="16"/>
+              </w:rPr>
+              <w:t>Gerente de alianzas la lista; gerencia los QR</w:t>
+            </w:r>
+          </w:p>
+        </w:tc>
+      </w:tr>
+      <w:tr>
+        <w:tc>
+          <w:tcPr>
+            <w:tcW w:type="dxa" w:w="7710"/>
+          </w:tcPr>
+          <w:p>
+            <w:pPr>
+              <w:spacing w:after="0"/>
+            </w:pPr>
+            <w:r>
+              <w:rPr>
+                <w:b/>
+                <w:sz w:val="16"/>
+              </w:rPr>
+              <w:t>Aval de la dirección de cada oficina donde se presente el programa, antes de la primera asesora.</w:t>
+            </w:r>
+          </w:p>
+        </w:tc>
+        <w:tc>
+          <w:tcPr>
+            <w:tcW w:type="dxa" w:w="2721"/>
           </w:tcPr>
           <w:p>
             <w:pPr>
@@ -1266,47 +1326,17 @@
           </w:p>
         </w:tc>
       </w:tr>
-      <w:tr>
-        <w:tc>
-          <w:tcPr>
-            <w:tcW w:type="dxa" w:w="8164"/>
-          </w:tcPr>
-          <w:p>
-            <w:pPr>
-              <w:spacing w:after="0"/>
-            </w:pPr>
-            <w:r>
-              <w:rPr>
-                <w:b/>
-                <w:sz w:val="16"/>
-              </w:rPr>
-              <w:t>Aval de la dirección de cada oficina donde se presente el programa.</w:t>
-            </w:r>
-          </w:p>
-        </w:tc>
-        <w:tc>
-          <w:tcPr>
-            <w:tcW w:type="dxa" w:w="2268"/>
-          </w:tcPr>
-          <w:p>
-            <w:pPr>
-              <w:spacing w:after="0"/>
-            </w:pPr>
-            <w:r>
-              <w:rPr>
-                <w:b w:val="0"/>
-                <w:sz w:val="16"/>
-              </w:rPr>
-              <w:t>Gerente de alianzas, antes de la primera asesora</w:t>
-            </w:r>
-          </w:p>
-        </w:tc>
-      </w:tr>
     </w:tbl>
     <w:p>
       <w:pPr>
-        <w:spacing w:after="0" w:before="0" w:line="20" w:lineRule="exact"/>
+        <w:spacing w:after="0" w:line="20" w:lineRule="exact" w:before="0"/>
       </w:pPr>
+      <w:r>
+        <w:rPr>
+          <w:sz w:val="8"/>
+        </w:rPr>
+        <w:t xml:space="preserve"> </w:t>
+      </w:r>
       <w:r>
         <w:rPr>
           <w:sz w:val="2"/>
@@ -1316,7 +1346,7 @@
     </w:p>
     <w:sectPr>
       <w:pgSz w:w="12240" w:h="15840"/>
-      <w:pgMar w:top="454" w:right="737" w:bottom="283" w:left="737" w:header="720" w:footer="720" w:gutter="0"/>
+      <w:pgMar w:top="340" w:right="737" w:bottom="227" w:left="737" w:header="720" w:footer="720" w:gutter="0"/>
       <w:cols w:space="720"/>
       <w:docGrid w:linePitch="360"/>
     </w:sectPr>

</xml_diff>

<commit_message>
Programa referidos asesores: durante el piloto el gerente de alianzas tambien agenda y cierra
Co-Authored-By: Claude Fable 5.1 <noreply@anthropic.com>
</commit_message>
<xml_diff>
--- a/recursos/comercial/INDUCCION_COMERCIAL/contratacion comercial/PROGRAMA_REFERIDOS_ASESORES_ENTIDADES.docx
+++ b/recursos/comercial/INDUCCION_COMERCIAL/contratacion comercial/PROGRAMA_REFERIDOS_ASESORES_ENTIDADES.docx
@@ -776,7 +776,7 @@
                 <w:b w:val="0"/>
                 <w:sz w:val="16"/>
               </w:rPr>
-              <w:t>Responde en menos de un día hábil, confirma el código contra la lista de códigos y pasa el contacto a la asesora comercial para la cita. No vende él.</w:t>
+              <w:t>Responde en menos de un día hábil, confirma el código contra la lista de códigos y agenda la cita. Cierra él o la pasa a la asesora comercial: durante el piloto él también vende.</w:t>
             </w:r>
           </w:p>
         </w:tc>
@@ -812,7 +812,7 @@
                 <w:b w:val="0"/>
                 <w:sz w:val="16"/>
               </w:rPr>
-              <w:t>Asesora comercial</w:t>
+              <w:t>Quien cierre</w:t>
             </w:r>
           </w:p>
         </w:tc>

</xml_diff>

<commit_message>
Programa referidos asesores: hoja regenerada sin las dos frases; script de QR corregido (archivo de enlaces)
Co-Authored-By: Claude Fable 5.1 <noreply@anthropic.com>
</commit_message>
<xml_diff>
--- a/recursos/comercial/INDUCCION_COMERCIAL/contratacion comercial/PROGRAMA_REFERIDOS_ASESORES_ENTIDADES.docx
+++ b/recursos/comercial/INDUCCION_COMERCIAL/contratacion comercial/PROGRAMA_REFERIDOS_ASESORES_ENTIDADES.docx
@@ -135,7 +135,7 @@
                 <w:b w:val="0"/>
                 <w:sz w:val="16"/>
               </w:rPr>
-              <w:t>$200.000 por matrícula. Fijo, igual para todas las entidades y todas las asesoras. Ni un peso más sin pasar por gerencia.</w:t>
+              <w:t>$200.000 por matrícula. Fijo, igual para todas las entidades y todas las asesoras.</w:t>
             </w:r>
           </w:p>
         </w:tc>
@@ -243,7 +243,7 @@
                 <w:b w:val="0"/>
                 <w:sz w:val="16"/>
               </w:rPr>
-              <w:t>En el cierre del mes en que entra el pago. La recarga la autoriza el financiero después de revisar el cierre contable del mes. El gerente de alianzas no autoriza recargas: es parte interesada.</w:t>
+              <w:t>En el cierre del mes en que entra el pago. La recarga la autoriza el financiero después de revisar el cierre contable del mes.</w:t>
             </w:r>
           </w:p>
         </w:tc>
@@ -354,7 +354,7 @@
           <w:b w:val="0"/>
           <w:sz w:val="18"/>
         </w:rPr>
-        <w:t>Cada asesora tiene un código propio (por ejemplo C-07) y un QR con ese código, impreso y por WhatsApp. El QR abre WhatsApp en la línea de alianzas (316 768 8793) con el mensaje ya escrito: "Hola, quiero información para estudiar inglés en Heiiu. Código de asesor: C-07". El mismo enlace se reenvía por WhatsApp. La asesora no digita datos de nadie.</w:t>
+        <w:t>Cada asesora tiene un código propio (por ejemplo C-07) y un QR con ese código, impreso y por WhatsApp. El QR abre WhatsApp en la línea de alianzas (316 768 8793) con el mensaje ya escrito: "Hola, quiero información para estudiar inglés en Heiiu. Código de asesor: C-07". El mismo enlace (uno por código, en el archivo ENLACES_CODIGOS.txt junto a los QR) se reenvía por WhatsApp. La asesora no digita datos de nadie.</w:t>
       </w:r>
     </w:p>
     <w:p>

</xml_diff>

<commit_message>
Programa referidos asesores: seccion 5 en primera persona del plural (lo que no ofrecemos ni hacemos)
Co-Authored-By: Claude Fable 5.1 <noreply@anthropic.com>
</commit_message>
<xml_diff>
--- a/recursos/comercial/INDUCCION_COMERCIAL/contratacion comercial/PROGRAMA_REFERIDOS_ASESORES_ENTIDADES.docx
+++ b/recursos/comercial/INDUCCION_COMERCIAL/contratacion comercial/PROGRAMA_REFERIDOS_ASESORES_ENTIDADES.docx
@@ -1040,7 +1040,7 @@
           <w:color w:val="E54C09"/>
           <w:sz w:val="21"/>
         </w:rPr>
-        <w:t>5. Lo que el gerente de alianzas no puede ofrecer ni hacer</w:t>
+        <w:t>5. Lo que no ofrecemos ni hacemos</w:t>
       </w:r>
     </w:p>
     <w:tbl>
@@ -1066,7 +1066,7 @@
               <w:rPr>
                 <w:sz w:val="17"/>
               </w:rPr>
-              <w:t>• Efectivo, transferencias o cualquier pago fuera de la tarjeta.  • Más de $200.000 o cualquier escalera de montos.  • Metas por mes o por trimestre.  • Piezas con logos de las entidades, o piezas distintas a la aprobada por gerencia.  • Entrar a una oficina con el programa sin que la dirección de esa oficina lo sepa; si una entidad dice que sus asesoras no pueden recibirlo, en esa entidad el programa se cae y queda solo el premio.  • Contactar a un afiliado antes de que escriba.  • Aportar él mismo dinero, bonos o regalos a una asesora.</w:t>
+              <w:t>• Efectivo, transferencias o cualquier pago fuera de la tarjeta.  • Más de $200.000 o cualquier escalera de montos.  • Metas por mes o por trimestre.  • Piezas con logos de las entidades, o piezas distintas a la aprobada por gerencia.  • Entrar a una oficina con el programa sin que la dirección de esa oficina lo sepa; si una entidad dice que sus asesoras no pueden recibirlo, en esa entidad el programa se cae y queda solo el premio.  • Contactar a un afiliado antes de que escriba.  • Dinero, bonos o regalos a una asesora por fuera del programa.</w:t>
             </w:r>
           </w:p>
         </w:tc>

</xml_diff>

<commit_message>
Programa referidos asesores: los codigos se asignan a medida que se inscriben las asesoras en el Excel de registro
Co-Authored-By: Claude Fable 5.1 <noreply@anthropic.com>
</commit_message>
<xml_diff>
--- a/recursos/comercial/INDUCCION_COMERCIAL/contratacion comercial/PROGRAMA_REFERIDOS_ASESORES_ENTIDADES.docx
+++ b/recursos/comercial/INDUCCION_COMERCIAL/contratacion comercial/PROGRAMA_REFERIDOS_ASESORES_ENTIDADES.docx
@@ -1268,7 +1268,7 @@
                 <w:b/>
                 <w:sz w:val="16"/>
               </w:rPr>
-              <w:t>Lista de códigos por asesora (sin nombres en la lista que circula) y un QR por código, impreso y por WhatsApp.</w:t>
+              <w:t>Los códigos y sus QR ya existen (C-01 a C-10). Cada código se asigna a una asesora al inscribirla en la hoja ASESORAS del Excel de registro, con su autorización de datos firmada; se le entrega su QR impreso y por WhatsApp. Más códigos cuando se agoten.</w:t>
             </w:r>
           </w:p>
         </w:tc>
@@ -1285,7 +1285,7 @@
                 <w:b w:val="0"/>
                 <w:sz w:val="16"/>
               </w:rPr>
-              <w:t>Gerente de alianzas la lista; gerencia los QR</w:t>
+              <w:t>Gerente de alianzas</w:t>
             </w:r>
           </w:p>
         </w:tc>

</xml_diff>

<commit_message>
Programa referidos asesores: version para entregar al gerente de alianzas (QR y enlace por asesora, Excel de registro en Google Drive compartido con gerencia y coordinacion, sin referencias a archivos internos)
Co-Authored-By: Claude Fable 5.1 <noreply@anthropic.com>
</commit_message>
<xml_diff>
--- a/recursos/comercial/INDUCCION_COMERCIAL/contratacion comercial/PROGRAMA_REFERIDOS_ASESORES_ENTIDADES.docx
+++ b/recursos/comercial/INDUCCION_COMERCIAL/contratacion comercial/PROGRAMA_REFERIDOS_ASESORES_ENTIDADES.docx
@@ -354,7 +354,7 @@
           <w:b w:val="0"/>
           <w:sz w:val="18"/>
         </w:rPr>
-        <w:t>Cada asesora tiene un código propio (por ejemplo C-07) y un QR con ese código, impreso y por WhatsApp. El QR abre WhatsApp en la línea de alianzas (316 768 8793) con el mensaje ya escrito: "Hola, quiero información para estudiar inglés en Heiiu. Código de asesor: C-07". El mismo enlace (uno por código, en el archivo ENLACES_CODIGOS.txt junto a los QR) se reenvía por WhatsApp. La asesora no digita datos de nadie.</w:t>
+        <w:t>Cada asesora tiene un código propio (por ejemplo C-07), un QR y un enlace con ese código. Los dos abren WhatsApp en la línea de alianzas (316 768 8793) con el mensaje ya escrito: "Hola, quiero información para estudiar inglés en Heiiu. Código de asesor: C-07". La asesora muestra el QR o reenvía el enlace; no digita datos de nadie.</w:t>
       </w:r>
     </w:p>
     <w:p>
@@ -366,7 +366,7 @@
           <w:b w:val="0"/>
           <w:sz w:val="18"/>
         </w:rPr>
-        <w:t>El primer mensaje lo manda el afiliado, no nosotros: escanea el QR o toca el enlace y pulsa enviar. Su número, el código y la hora quedan en la línea; ese es el registro. Heiiu no llama a nadie que no haya escrito. Coordinación lleva en una hoja de cálculo cada mensaje con código: fecha, código, celular, contactado, cita, matrícula pagada, bono recargado.</w:t>
+        <w:t>El primer mensaje lo manda el afiliado, no nosotros: escanea el QR o toca el enlace y pulsa enviar. Su número, el código y la hora quedan en la línea; ese es el registro. Heiiu no llama a nadie que no haya escrito. Cada mensaje con código se anota el mismo día en el Excel de registro (REGISTRO_REFERIDOS_ASESORAS), que vive en Google Drive compartido con gerencia y con coordinación, para que las dos vean la actividad sin pedir el archivo.</w:t>
       </w:r>
     </w:p>
     <w:tbl>
@@ -776,7 +776,7 @@
                 <w:b w:val="0"/>
                 <w:sz w:val="16"/>
               </w:rPr>
-              <w:t>Responde en menos de un día hábil, confirma el código contra la lista de códigos y agenda la cita. Cierra él o la pasa a la asesora comercial.</w:t>
+              <w:t>Responde en menos de un día hábil, anota el mensaje en el Excel de registro y agenda la cita. Cierra él o la pasa a la asesora comercial.</w:t>
             </w:r>
           </w:p>
         </w:tc>
@@ -882,7 +882,7 @@
                 <w:b w:val="0"/>
                 <w:sz w:val="16"/>
               </w:rPr>
-              <w:t>Anota en la hoja de cálculo cada mensaje con código y marca: contactado · cita · matrícula pagada · bono recargado, con fecha. Verifica base previa y los 30 días.</w:t>
+              <w:t>En el Excel verifica gestión previa y los 30 días, y marca con fecha: matrícula pagada · pago recibido · retracto cumplido · bono recargado.</w:t>
             </w:r>
           </w:p>
         </w:tc>
@@ -1160,7 +1160,43 @@
                 <w:b/>
                 <w:sz w:val="16"/>
               </w:rPr>
-              <w:t>Dos cotizaciones del proveedor de tarjeta: emisión, comisión por recarga, compra mínima, y su carta de condiciones.</w:t>
+              <w:t>Condiciones del proveedor de tarjeta por escrito: permanencia, saldos, entrega, factura y contrato a nombre de la razón social.</w:t>
+            </w:r>
+          </w:p>
+        </w:tc>
+        <w:tc>
+          <w:tcPr>
+            <w:tcW w:type="dxa" w:w="2721"/>
+          </w:tcPr>
+          <w:p>
+            <w:pPr>
+              <w:spacing w:after="0"/>
+            </w:pPr>
+            <w:r>
+              <w:rPr>
+                <w:b w:val="0"/>
+                <w:sz w:val="16"/>
+              </w:rPr>
+              <w:t>Gerente de alianzas</w:t>
+            </w:r>
+          </w:p>
+        </w:tc>
+      </w:tr>
+      <w:tr>
+        <w:tc>
+          <w:tcPr>
+            <w:tcW w:type="dxa" w:w="7710"/>
+          </w:tcPr>
+          <w:p>
+            <w:pPr>
+              <w:spacing w:after="0"/>
+            </w:pPr>
+            <w:r>
+              <w:rPr>
+                <w:b/>
+                <w:sz w:val="16"/>
+              </w:rPr>
+              <w:t>Excel de registro en Google Drive, compartido con gerencia y coordinación.</w:t>
             </w:r>
           </w:p>
         </w:tc>

</xml_diff>

<commit_message>
Referidos asesores: bono de 50.000 por matricula a cuotas al pagar el 50% (hoja, pieza y Excel de registro con forma de pago y monto calculado)
Co-Authored-By: Claude Fable 5.1 <noreply@anthropic.com>
</commit_message>
<xml_diff>
--- a/recursos/comercial/INDUCCION_COMERCIAL/contratacion comercial/PROGRAMA_REFERIDOS_ASESORES_ENTIDADES.docx
+++ b/recursos/comercial/INDUCCION_COMERCIAL/contratacion comercial/PROGRAMA_REFERIDOS_ASESORES_ENTIDADES.docx
@@ -38,7 +38,7 @@
           <w:b w:val="0"/>
           <w:sz w:val="18"/>
         </w:rPr>
-        <w:t>Qué es: un bono para el asesor o asesora de una entidad aliada (caja, cooperativa, fondo) por cada afiliado que escriba a Heiiu con su código y se matricule pagando de contado. Qué no es: una comisión de venta. La asesora refiere; la cita y el cierre los hace nuestro equipo. Todo lo que se ofrece está en esta hoja; lo que no está aquí, no se ofrece.</w:t>
+        <w:t>Qué es: un bono para el asesor o asesora de una entidad aliada (caja, cooperativa, fondo) por cada afiliado que escriba a Heiiu con su código y se matricule: $200.000 de contado, $50.000 a cuotas. Qué no es: una comisión de venta. La asesora refiere; la cita y el cierre los hace nuestro equipo. Todo lo que se ofrece está en esta hoja; lo que no está aquí, no se ofrece.</w:t>
       </w:r>
     </w:p>
     <w:p>
@@ -61,8 +61,8 @@
         <w:tblLook w:firstColumn="1" w:firstRow="1" w:lastColumn="0" w:lastRow="0" w:noHBand="0" w:noVBand="1" w:val="04A0"/>
       </w:tblPr>
       <w:tblGrid>
-        <w:gridCol w:w="5383"/>
-        <w:gridCol w:w="5383"/>
+        <w:gridCol w:w="5553"/>
+        <w:gridCol w:w="5553"/>
       </w:tblGrid>
       <w:tr>
         <w:tc>
@@ -86,7 +86,7 @@
         </w:tc>
         <w:tc>
           <w:tcPr>
-            <w:tcW w:type="dxa" w:w="8617"/>
+            <w:tcW w:type="dxa" w:w="8957"/>
             <w:shd w:val="clear" w:color="auto" w:fill="E54C09"/>
           </w:tcPr>
           <w:p>
@@ -124,7 +124,7 @@
         </w:tc>
         <w:tc>
           <w:tcPr>
-            <w:tcW w:type="dxa" w:w="8617"/>
+            <w:tcW w:type="dxa" w:w="8957"/>
           </w:tcPr>
           <w:p>
             <w:pPr>
@@ -135,7 +135,7 @@
                 <w:b w:val="0"/>
                 <w:sz w:val="16"/>
               </w:rPr>
-              <w:t>$200.000 por matrícula. Fijo, igual para todas las entidades y todas las asesoras.</w:t>
+              <w:t>$200.000 por matrícula pagada de contado (directo o con el crédito de la entidad). $50.000 por matrícula a cuotas con Heiiu, cuando el afiliado haya pagado el 50% del programa al día. Dos montos según la forma de pago, iguales para todas las entidades y asesoras; el tope es $200.000.</w:t>
             </w:r>
           </w:p>
         </w:tc>
@@ -160,7 +160,7 @@
         </w:tc>
         <w:tc>
           <w:tcPr>
-            <w:tcW w:type="dxa" w:w="8617"/>
+            <w:tcW w:type="dxa" w:w="8957"/>
           </w:tcPr>
           <w:p>
             <w:pPr>
@@ -196,7 +196,7 @@
         </w:tc>
         <w:tc>
           <w:tcPr>
-            <w:tcW w:type="dxa" w:w="8617"/>
+            <w:tcW w:type="dxa" w:w="8957"/>
           </w:tcPr>
           <w:p>
             <w:pPr>
@@ -207,7 +207,7 @@
                 <w:b w:val="0"/>
                 <w:sz w:val="16"/>
               </w:rPr>
-              <w:t>Matrícula con contrato firmado, pagada de contado (directo o con el crédito de la entidad), con los cinco días de retracto cumplidos y el pago recibido por Heiiu. En las entidades que pagan a 30 días, cuando pagan.</w:t>
+              <w:t>Contado: contrato firmado, cinco días de retracto cumplidos y pago recibido por Heiiu (en las entidades que pagan a 30 días, cuando pagan). Cuotas: contrato firmado, retracto cumplido y el 50% del programa pagado al día.</w:t>
             </w:r>
           </w:p>
         </w:tc>
@@ -232,7 +232,7 @@
         </w:tc>
         <w:tc>
           <w:tcPr>
-            <w:tcW w:type="dxa" w:w="8617"/>
+            <w:tcW w:type="dxa" w:w="8957"/>
           </w:tcPr>
           <w:p>
             <w:pPr>
@@ -268,7 +268,7 @@
         </w:tc>
         <w:tc>
           <w:tcPr>
-            <w:tcW w:type="dxa" w:w="8617"/>
+            <w:tcW w:type="dxa" w:w="8957"/>
           </w:tcPr>
           <w:p>
             <w:pPr>
@@ -279,7 +279,7 @@
                 <w:b w:val="0"/>
                 <w:sz w:val="16"/>
               </w:rPr>
-              <w:t>Matrículas financiadas por cuotas con Heiiu; afiliados con gestión humana de nuestro equipo en los 30 días previos a su mensaje; referidos sin código; retiros dentro del retracto.</w:t>
+              <w:t>Afiliados con gestión humana de nuestro equipo en los 30 días previos a su mensaje; referidos sin código; retiros dentro del retracto; cuotas que se atrasan antes de llegar al 50%.</w:t>
             </w:r>
           </w:p>
         </w:tc>
@@ -304,7 +304,7 @@
         </w:tc>
         <w:tc>
           <w:tcPr>
-            <w:tcW w:type="dxa" w:w="8617"/>
+            <w:tcW w:type="dxa" w:w="8957"/>
           </w:tcPr>
           <w:p>
             <w:pPr>
@@ -315,7 +315,7 @@
                 <w:b w:val="0"/>
                 <w:sz w:val="16"/>
               </w:rPr>
-              <w:t>De cada bono, $100.000 los pone Heiiu y $100.000 se descuentan de la comisión del gerente de alianzas por esa misma matrícula, con su autorización firmada. Se revisa al cierre del piloto; si cambia, se aumenta el bono o se deja igual.</w:t>
+              <w:t>De cada bono, la mitad la pone Heiiu y la otra mitad se descuenta de la comisión del gerente de alianzas por esa misma matrícula ($100.000 y $100.000 en contado, $25.000 y $25.000 en cuotas), con su autorización firmada. Se revisa al cierre del piloto; si cambia, se aumenta el bono o se deja igual.</w:t>
             </w:r>
           </w:p>
         </w:tc>
@@ -366,7 +366,7 @@
           <w:b w:val="0"/>
           <w:sz w:val="18"/>
         </w:rPr>
-        <w:t>El primer mensaje lo manda el afiliado, no nosotros: escanea el QR o toca el enlace y pulsa enviar. Su número, el código y la hora quedan en la línea; ese es el registro. Heiiu no llama a nadie que no haya escrito. Cada mensaje con código se anota el mismo día en el Excel de registro (REGISTRO_REFERIDOS_ASESORAS), que vive en Google Drive compartido con gerencia y con coordinación, para que las dos vean la actividad sin pedir el archivo.</w:t>
+        <w:t>El primer mensaje lo manda el afiliado, no nosotros: escanea el QR o toca el enlace y pulsa enviar. Su número, el código y la hora quedan en la línea; ese es el registro. Heiiu no llama a nadie que no haya escrito. Cada mensaje con código se anota el mismo día en el Excel de registro, que vive en Google Drive compartido con gerencia y coordinación para que vean la actividad sin pedir el archivo.</w:t>
       </w:r>
     </w:p>
     <w:tbl>
@@ -376,8 +376,8 @@
         <w:tblLook w:firstColumn="1" w:firstRow="1" w:lastColumn="0" w:lastRow="0" w:noHBand="0" w:noVBand="1" w:val="04A0"/>
       </w:tblPr>
       <w:tblGrid>
-        <w:gridCol w:w="5383"/>
-        <w:gridCol w:w="5383"/>
+        <w:gridCol w:w="5553"/>
+        <w:gridCol w:w="5553"/>
       </w:tblGrid>
       <w:tr>
         <w:tc>
@@ -401,7 +401,7 @@
         </w:tc>
         <w:tc>
           <w:tcPr>
-            <w:tcW w:type="dxa" w:w="8617"/>
+            <w:tcW w:type="dxa" w:w="8957"/>
             <w:shd w:val="clear" w:color="auto" w:fill="E54C09"/>
           </w:tcPr>
           <w:p>
@@ -439,7 +439,7 @@
         </w:tc>
         <w:tc>
           <w:tcPr>
-            <w:tcW w:type="dxa" w:w="8617"/>
+            <w:tcW w:type="dxa" w:w="8957"/>
           </w:tcPr>
           <w:p>
             <w:pPr>
@@ -475,7 +475,7 @@
         </w:tc>
         <w:tc>
           <w:tcPr>
-            <w:tcW w:type="dxa" w:w="8617"/>
+            <w:tcW w:type="dxa" w:w="8957"/>
           </w:tcPr>
           <w:p>
             <w:pPr>
@@ -511,7 +511,7 @@
         </w:tc>
         <w:tc>
           <w:tcPr>
-            <w:tcW w:type="dxa" w:w="8617"/>
+            <w:tcW w:type="dxa" w:w="8957"/>
           </w:tcPr>
           <w:p>
             <w:pPr>
@@ -522,7 +522,7 @@
                 <w:b w:val="0"/>
                 <w:sz w:val="16"/>
               </w:rPr>
-              <w:t>Que el celular ya esté en nuestra base (pauta, plataforma, reactivaciones) no quita el bono. Lo quita que en los 30 días previos al mensaje alguien del equipo lo haya llamado o gestionado; los mensajes automáticos del bot no cuentan como gestión. Coordinación lo verifica antes de marcar la matrícula como referida.</w:t>
+              <w:t>Estar en nuestra base (pauta, plataforma, reactivaciones) no quita el bono. Lo quita que en los 30 días previos al mensaje alguien del equipo lo haya llamado o gestionado; los mensajes automáticos del bot no cuentan. Coordinación lo verifica.</w:t>
             </w:r>
           </w:p>
         </w:tc>
@@ -559,9 +559,9 @@
         <w:tblLook w:firstColumn="1" w:firstRow="1" w:lastColumn="0" w:lastRow="0" w:noHBand="0" w:noVBand="1" w:val="04A0"/>
       </w:tblPr>
       <w:tblGrid>
-        <w:gridCol w:w="3589"/>
-        <w:gridCol w:w="3589"/>
-        <w:gridCol w:w="3589"/>
+        <w:gridCol w:w="3702"/>
+        <w:gridCol w:w="3702"/>
+        <w:gridCol w:w="3702"/>
       </w:tblGrid>
       <w:tr>
         <w:tc>
@@ -604,7 +604,7 @@
         </w:tc>
         <w:tc>
           <w:tcPr>
-            <w:tcW w:type="dxa" w:w="7824"/>
+            <w:tcW w:type="dxa" w:w="8164"/>
             <w:shd w:val="clear" w:color="auto" w:fill="E54C09"/>
           </w:tcPr>
           <w:p>
@@ -659,7 +659,7 @@
         </w:tc>
         <w:tc>
           <w:tcPr>
-            <w:tcW w:type="dxa" w:w="7824"/>
+            <w:tcW w:type="dxa" w:w="8164"/>
           </w:tcPr>
           <w:p>
             <w:pPr>
@@ -712,7 +712,7 @@
         </w:tc>
         <w:tc>
           <w:tcPr>
-            <w:tcW w:type="dxa" w:w="7824"/>
+            <w:tcW w:type="dxa" w:w="8164"/>
           </w:tcPr>
           <w:p>
             <w:pPr>
@@ -765,7 +765,7 @@
         </w:tc>
         <w:tc>
           <w:tcPr>
-            <w:tcW w:type="dxa" w:w="7824"/>
+            <w:tcW w:type="dxa" w:w="8164"/>
           </w:tcPr>
           <w:p>
             <w:pPr>
@@ -818,7 +818,7 @@
         </w:tc>
         <w:tc>
           <w:tcPr>
-            <w:tcW w:type="dxa" w:w="7824"/>
+            <w:tcW w:type="dxa" w:w="8164"/>
           </w:tcPr>
           <w:p>
             <w:pPr>
@@ -871,7 +871,7 @@
         </w:tc>
         <w:tc>
           <w:tcPr>
-            <w:tcW w:type="dxa" w:w="7824"/>
+            <w:tcW w:type="dxa" w:w="8164"/>
           </w:tcPr>
           <w:p>
             <w:pPr>
@@ -924,7 +924,7 @@
         </w:tc>
         <w:tc>
           <w:tcPr>
-            <w:tcW w:type="dxa" w:w="7824"/>
+            <w:tcW w:type="dxa" w:w="8164"/>
           </w:tcPr>
           <w:p>
             <w:pPr>
@@ -977,7 +977,7 @@
         </w:tc>
         <w:tc>
           <w:tcPr>
-            <w:tcW w:type="dxa" w:w="7824"/>
+            <w:tcW w:type="dxa" w:w="8164"/>
           </w:tcPr>
           <w:p>
             <w:pPr>
@@ -1027,7 +1027,7 @@
           <w:b w:val="0"/>
           <w:sz w:val="18"/>
         </w:rPr>
-        <w:t>La asesora que más matrículas pagadas traiga hasta el 31 de enero de 2027 recibe un nivel de inglés en Heiiu para ella o para un familiar, en un grupo con cupo disponible. Un solo premio; en empate, gana quien llegó primero al número. No hay metas por mes ni por trimestre.</w:t>
+        <w:t>La asesora que más matrículas con bono traiga hasta el 31 de enero de 2027 recibe un nivel de inglés en Heiiu para ella o para un familiar, en un grupo con cupo disponible. Un solo premio; en empate, gana quien llegó primero al número. No hay metas por mes ni por trimestre.</w:t>
       </w:r>
     </w:p>
     <w:p>
@@ -1050,12 +1050,12 @@
         <w:tblLook w:firstColumn="1" w:firstRow="1" w:lastColumn="0" w:lastRow="0" w:noHBand="0" w:noVBand="1" w:val="04A0"/>
       </w:tblPr>
       <w:tblGrid>
-        <w:gridCol w:w="10766"/>
+        <w:gridCol w:w="11106"/>
       </w:tblGrid>
       <w:tr>
         <w:tc>
           <w:tcPr>
-            <w:tcW w:type="dxa" w:w="10766"/>
+            <w:tcW w:type="dxa" w:w="11106"/>
             <w:shd w:val="clear" w:color="auto" w:fill="FFF8E7"/>
           </w:tcPr>
           <w:p>
@@ -1103,13 +1103,13 @@
         <w:tblLook w:firstColumn="1" w:firstRow="1" w:lastColumn="0" w:lastRow="0" w:noHBand="0" w:noVBand="1" w:val="04A0"/>
       </w:tblPr>
       <w:tblGrid>
-        <w:gridCol w:w="5383"/>
-        <w:gridCol w:w="5383"/>
+        <w:gridCol w:w="5553"/>
+        <w:gridCol w:w="5553"/>
       </w:tblGrid>
       <w:tr>
         <w:tc>
           <w:tcPr>
-            <w:tcW w:type="dxa" w:w="7710"/>
+            <w:tcW w:type="dxa" w:w="8050"/>
             <w:shd w:val="clear" w:color="auto" w:fill="E54C09"/>
           </w:tcPr>
           <w:p>
@@ -1149,7 +1149,7 @@
       <w:tr>
         <w:tc>
           <w:tcPr>
-            <w:tcW w:type="dxa" w:w="7710"/>
+            <w:tcW w:type="dxa" w:w="8050"/>
           </w:tcPr>
           <w:p>
             <w:pPr>
@@ -1185,7 +1185,7 @@
       <w:tr>
         <w:tc>
           <w:tcPr>
-            <w:tcW w:type="dxa" w:w="7710"/>
+            <w:tcW w:type="dxa" w:w="8050"/>
           </w:tcPr>
           <w:p>
             <w:pPr>
@@ -1221,7 +1221,7 @@
       <w:tr>
         <w:tc>
           <w:tcPr>
-            <w:tcW w:type="dxa" w:w="7710"/>
+            <w:tcW w:type="dxa" w:w="8050"/>
           </w:tcPr>
           <w:p>
             <w:pPr>
@@ -1257,7 +1257,7 @@
       <w:tr>
         <w:tc>
           <w:tcPr>
-            <w:tcW w:type="dxa" w:w="7710"/>
+            <w:tcW w:type="dxa" w:w="8050"/>
           </w:tcPr>
           <w:p>
             <w:pPr>
@@ -1268,7 +1268,7 @@
                 <w:b/>
                 <w:sz w:val="16"/>
               </w:rPr>
-              <w:t>Autorización firmada del descuento de $100.000 por bono en la comisión del gerente de alianzas.</w:t>
+              <w:t>Autorización firmada del descuento de la mitad de cada bono ($100.000 contado, $25.000 cuotas) en la comisión del gerente de alianzas.</w:t>
             </w:r>
           </w:p>
         </w:tc>
@@ -1293,7 +1293,7 @@
       <w:tr>
         <w:tc>
           <w:tcPr>
-            <w:tcW w:type="dxa" w:w="7710"/>
+            <w:tcW w:type="dxa" w:w="8050"/>
           </w:tcPr>
           <w:p>
             <w:pPr>
@@ -1304,7 +1304,7 @@
                 <w:b/>
                 <w:sz w:val="16"/>
               </w:rPr>
-              <w:t>Los códigos y sus QR ya existen (C-01 a C-10). Cada código se asigna a una asesora al inscribirla en la hoja ASESORAS del Excel de registro, con su autorización de datos firmada; se le entrega su QR impreso y por WhatsApp. Más códigos cuando se agoten.</w:t>
+              <w:t>Los códigos y sus QR ya existen (C-01 a C-10). Cada código se asigna a una asesora al inscribirla en la hoja ASESORAS del Excel, con su autorización de datos firmada; recibe su QR impreso y por WhatsApp.</w:t>
             </w:r>
           </w:p>
         </w:tc>
@@ -1329,7 +1329,7 @@
       <w:tr>
         <w:tc>
           <w:tcPr>
-            <w:tcW w:type="dxa" w:w="7710"/>
+            <w:tcW w:type="dxa" w:w="8050"/>
           </w:tcPr>
           <w:p>
             <w:pPr>
@@ -1382,7 +1382,7 @@
     </w:p>
     <w:sectPr>
       <w:pgSz w:w="12240" w:h="15840"/>
-      <w:pgMar w:top="340" w:right="737" w:bottom="227" w:left="737" w:header="720" w:footer="720" w:gutter="0"/>
+      <w:pgMar w:top="340" w:right="567" w:bottom="227" w:left="567" w:header="720" w:footer="720" w:gutter="0"/>
       <w:cols w:space="720"/>
       <w:docGrid w:linePitch="360"/>
     </w:sectPr>
@@ -1755,7 +1755,7 @@
     <w:rsid w:val="00FC693F"/>
     <w:rPr>
       <w:rFonts w:ascii="Calibri" w:hAnsi="Calibri"/>
-      <w:sz w:val="18"/>
+      <w:sz w:val="17"/>
     </w:rPr>
   </w:style>
   <w:style w:type="paragraph" w:styleId="Header">

</xml_diff>